<commit_message>
Revise Taoist Book One with author corrections
</commit_message>
<xml_diff>
--- a/taoist/book-1/Taoist-Book-1-Editable.docx
+++ b/taoist/book-1/Taoist-Book-1-Editable.docx
@@ -836,7 +836,7 @@
           </w:tcPr>
           <w:p>
             <w:r>
-              <w:t>Feature</w:t>
+              <w:t>—</w:t>
             </w:r>
           </w:p>
         </w:tc>
@@ -1388,7 +1388,7 @@
           </w:tcPr>
           <w:p>
             <w:r>
-              <w:t>Feature</w:t>
+              <w:t>—</w:t>
             </w:r>
           </w:p>
         </w:tc>
@@ -1756,7 +1756,7 @@
           </w:tcPr>
           <w:p>
             <w:r>
-              <w:t>Feature</w:t>
+              <w:t>—</w:t>
             </w:r>
           </w:p>
         </w:tc>
@@ -2216,7 +2216,7 @@
           </w:tcPr>
           <w:p>
             <w:r>
-              <w:t>Ravager Arts, Cap Feature</w:t>
+              <w:t>Ravager Arts</w:t>
             </w:r>
           </w:p>
         </w:tc>
@@ -2319,7 +2319,7 @@
     </w:p>
     <w:p>
       <w:r>
-        <w:t>The Taoist is a Low Caster. She selects a casting tradition at 1st level and gains a spell pool equal to her caster level + her casting ability modifier. Her caster level equals her Taoist class level, as shown on the class table.</w:t>
+        <w:t>The Taoist is a Mid Caster. She selects a casting tradition at 1st level and gains a spell pool equal to her caster level + her casting ability modifier. Her caster level follows the Mid Caster progression shown on the class table.</w:t>
       </w:r>
     </w:p>
     <w:p>
@@ -5674,7 +5674,7 @@
     </w:p>
     <w:p>
       <w:r>
-        <w:t>This feature replaces Channel Energy. At 1st level, the Taoist binds two demons. She gains additional bound demons according to the Blade Monarch’s Echoes progression, treating her Taoist level as her Blade Monarch level. Each bound demon otherwise uses the Echo Progression Table, with Echo terminology replaced by Bound Demon terminology. Only one bound demon may be active at a time. The Taoist may switch her active bound demon as a swift action. While active, the bound demon grants every power it has unlocked at the Taoist’s current class level. When activating a bound demon, the Taoist chooses whether to possess it, gaining its abilities through her own body, or manifest it as a spiritual projection. Changing between possession and manifestation is a swift action. Manifestation does not grant the demon independent actions or a separate resource economy unless one of its abilities expressly says otherwise.</w:t>
+        <w:t>This feature replaces Channel Energy. At 1st level, the Taoist binds two demons. She gains additional bound demons according to the Night Monarch’s Echoes progression, treating her Taoist level as her Night Monarch level. Each bound demon otherwise uses the Echo Progression Table, with Echo terminology replaced by Bound Demon terminology. Only one bound demon may be active at a time. The Taoist may switch her active bound demon as a swift action. While active, the bound demon grants every power it has unlocked at the Taoist’s current class level. When activating a bound demon, the Taoist chooses whether to possess it, gaining its abilities through her own body, or manifest it as a spiritual projection. Changing between possession and manifestation is a swift action. Manifestation does not grant the demon independent actions or a separate resource economy unless one of its abilities expressly says otherwise.</w:t>
       </w:r>
     </w:p>
     <w:p>
@@ -5765,7 +5765,7 @@
     </w:p>
     <w:p>
       <w:r>
-        <w:t>Every Guardian archetype grants three abilities at 1st level: Guardian Bounty, Spiritual Development, and Alertness. These are defined as follows: Guardian Bounty: The core resource or progression system granted by this archetype. What this means depends on the archetype — see each archetype's section for its specific Bounty. Sphere Guardian: sphere talents. Martial Guardian: Path of War maneuver progression. Rune Guardian: runes. Sura Guardian: imprints. Invocation Guardian: invocations. Geomancy Guardian: geomancy (pending). Spiritual Development: The Guardian enhances the physical capabilities of bound creatures. This manifests as the Str/Dex boost shown in the archetype's progression table, which increases at specific Guardian HD thresholds. Alertness: While this Guardian is active, the user gains the Alertness feat, as per the standard familiar ability of the same name.</w:t>
+        <w:t>Every Guardian archetype grants three abilities at 1st level: Guardian Bounty, Spiritual Development, and Alertness. These are defined as follows: Guardian Bounty: The core resource or progression system granted by this archetype. What this means depends on the archetype — see each archetype's section for its specific Bounty. Sphere Guardian: sphere talents. Martial Guardian: Path of War maneuver progression. Rune Guardian: runes. Sura Guardian: imprints. Invocation Guardian: invocations. Spiritual Development: The Guardian enhances the physical capabilities of bound creatures. This manifests as the Str/Dex boost shown in the archetype's progression table, which increases at specific Guardian HD thresholds. Alertness: While this Guardian is active, the user gains the Alertness feat, as per the standard familiar ability of the same name.</w:t>
       </w:r>
     </w:p>
     <w:p>
@@ -13708,12 +13708,7 @@
         <w:pStyle w:val="Heading1"/>
       </w:pPr>
       <w:r>
-        <w:t>Geomancy Guardian</w:t>
-      </w:r>
-    </w:p>
-    <w:p>
-      <w:r>
-        <w:t>This archetype is pending completion pending access to the relevant source material. The table structure below is reserved. Talent list to be added in a future revision.</w:t>
+        <w:t>Infusion Guardian</w:t>
       </w:r>
     </w:p>
     <w:p>
@@ -13721,1326 +13716,292 @@
         <w:pStyle w:val="Heading3"/>
       </w:pPr>
       <w:r>
-        <w:t>Geomancy Reserved Table</w:t>
-      </w:r>
-    </w:p>
-    <w:tbl>
-      <w:tblPr>
-        <w:tblStyle w:val="LightShading-Accent1"/>
-        <w:tblW w:type="auto" w:w="0"/>
-        <w:tblLook w:firstColumn="1" w:firstRow="1" w:lastColumn="0" w:lastRow="0" w:noHBand="0" w:noVBand="1" w:val="04A0"/>
-      </w:tblPr>
-      <w:tblGrid>
-        <w:gridCol w:w="1704"/>
-        <w:gridCol w:w="1704"/>
-        <w:gridCol w:w="1704"/>
-        <w:gridCol w:w="1704"/>
-        <w:gridCol w:w="1704"/>
-        <w:gridCol w:w="1704"/>
-      </w:tblGrid>
-      <w:tr>
-        <w:tc>
-          <w:tcPr>
-            <w:tcW w:type="dxa" w:w="1704"/>
-          </w:tcPr>
-          <w:p>
-            <w:r>
-              <w:t>Level</w:t>
-            </w:r>
-          </w:p>
-        </w:tc>
-        <w:tc>
-          <w:tcPr>
-            <w:tcW w:type="dxa" w:w="1704"/>
-          </w:tcPr>
-          <w:p>
-            <w:r>
-              <w:t>HD</w:t>
-            </w:r>
-          </w:p>
-        </w:tc>
-        <w:tc>
-          <w:tcPr>
-            <w:tcW w:type="dxa" w:w="1704"/>
-          </w:tcPr>
-          <w:p>
-            <w:r>
-              <w:t>Special</w:t>
-            </w:r>
-          </w:p>
-        </w:tc>
-        <w:tc>
-          <w:tcPr>
-            <w:tcW w:type="dxa" w:w="1704"/>
-          </w:tcPr>
-          <w:p>
-            <w:r>
-              <w:t>Str/Dex Boost</w:t>
-            </w:r>
-          </w:p>
-        </w:tc>
-        <w:tc>
-          <w:tcPr>
-            <w:tcW w:type="dxa" w:w="1704"/>
-          </w:tcPr>
-          <w:p>
-            <w:r>
-              <w:t>Talents per Guardian</w:t>
-            </w:r>
-          </w:p>
-        </w:tc>
-        <w:tc>
-          <w:tcPr>
-            <w:tcW w:type="dxa" w:w="1704"/>
-          </w:tcPr>
-          <w:p>
-            <w:r>
-              <w:t>Infusions Known</w:t>
-            </w:r>
-          </w:p>
-        </w:tc>
-      </w:tr>
-      <w:tr>
-        <w:tc>
-          <w:tcPr>
-            <w:tcW w:type="dxa" w:w="1704"/>
-          </w:tcPr>
-          <w:p>
-            <w:r>
-              <w:t>1</w:t>
-            </w:r>
-          </w:p>
-        </w:tc>
-        <w:tc>
-          <w:tcPr>
-            <w:tcW w:type="dxa" w:w="1704"/>
-          </w:tcPr>
-          <w:p>
-            <w:r>
-              <w:t>1</w:t>
-            </w:r>
-          </w:p>
-        </w:tc>
-        <w:tc>
-          <w:tcPr>
-            <w:tcW w:type="dxa" w:w="1704"/>
-          </w:tcPr>
-          <w:p>
-            <w:r>
-              <w:t>guardian Bounty, Spiritual Development , Alertness</w:t>
-            </w:r>
-          </w:p>
-        </w:tc>
-        <w:tc>
-          <w:tcPr>
-            <w:tcW w:type="dxa" w:w="1704"/>
-          </w:tcPr>
-          <w:p>
-            <w:r>
-              <w:t>—</w:t>
-            </w:r>
-          </w:p>
-        </w:tc>
-        <w:tc>
-          <w:tcPr>
-            <w:tcW w:type="dxa" w:w="1704"/>
-          </w:tcPr>
-          <w:p>
-            <w:r>
-              <w:t>2</w:t>
-            </w:r>
-          </w:p>
-        </w:tc>
-        <w:tc>
-          <w:tcPr>
-            <w:tcW w:type="dxa" w:w="1704"/>
-          </w:tcPr>
-          <w:p>
-            <w:r>
-              <w:t>2</w:t>
-            </w:r>
-          </w:p>
-        </w:tc>
-      </w:tr>
-      <w:tr>
-        <w:tc>
-          <w:tcPr>
-            <w:tcW w:type="dxa" w:w="1704"/>
-          </w:tcPr>
-          <w:p>
-            <w:r>
-              <w:t>2</w:t>
-            </w:r>
-          </w:p>
-        </w:tc>
-        <w:tc>
-          <w:tcPr>
-            <w:tcW w:type="dxa" w:w="1704"/>
-          </w:tcPr>
-          <w:p>
-            <w:r>
-              <w:t>1</w:t>
-            </w:r>
-          </w:p>
-        </w:tc>
-        <w:tc>
-          <w:tcPr>
-            <w:tcW w:type="dxa" w:w="1704"/>
-          </w:tcPr>
-          <w:p>
-            <w:r>
-              <w:t>Guardian Talent</w:t>
-            </w:r>
-          </w:p>
-        </w:tc>
-        <w:tc>
-          <w:tcPr>
-            <w:tcW w:type="dxa" w:w="1704"/>
-          </w:tcPr>
-          <w:p>
-            <w:r>
-              <w:t>—</w:t>
-            </w:r>
-          </w:p>
-        </w:tc>
-        <w:tc>
-          <w:tcPr>
-            <w:tcW w:type="dxa" w:w="1704"/>
-          </w:tcPr>
-          <w:p>
-            <w:r>
-              <w:t>3</w:t>
-            </w:r>
-          </w:p>
-        </w:tc>
-        <w:tc>
-          <w:tcPr>
-            <w:tcW w:type="dxa" w:w="1704"/>
-          </w:tcPr>
-          <w:p>
-            <w:r>
-              <w:t>3</w:t>
-            </w:r>
-          </w:p>
-        </w:tc>
-      </w:tr>
-      <w:tr>
-        <w:tc>
-          <w:tcPr>
-            <w:tcW w:type="dxa" w:w="1704"/>
-          </w:tcPr>
-          <w:p>
-            <w:r>
-              <w:t>3</w:t>
-            </w:r>
-          </w:p>
-        </w:tc>
-        <w:tc>
-          <w:tcPr>
-            <w:tcW w:type="dxa" w:w="1704"/>
-          </w:tcPr>
-          <w:p>
-            <w:r>
-              <w:t>2</w:t>
-            </w:r>
-          </w:p>
-        </w:tc>
-        <w:tc>
-          <w:tcPr>
-            <w:tcW w:type="dxa" w:w="1704"/>
-          </w:tcPr>
-          <w:p>
-            <w:r>
-              <w:t>Cultivated Power</w:t>
-            </w:r>
-          </w:p>
-        </w:tc>
-        <w:tc>
-          <w:tcPr>
-            <w:tcW w:type="dxa" w:w="1704"/>
-          </w:tcPr>
-          <w:p>
-            <w:r>
-              <w:t>+0</w:t>
-            </w:r>
-          </w:p>
-        </w:tc>
-        <w:tc>
-          <w:tcPr>
-            <w:tcW w:type="dxa" w:w="1704"/>
-          </w:tcPr>
-          <w:p>
-            <w:r>
-              <w:t>3</w:t>
-            </w:r>
-          </w:p>
-        </w:tc>
-        <w:tc>
-          <w:tcPr>
-            <w:tcW w:type="dxa" w:w="1704"/>
-          </w:tcPr>
-          <w:p>
-            <w:r>
-              <w:t>3</w:t>
-            </w:r>
-          </w:p>
-        </w:tc>
-      </w:tr>
-      <w:tr>
-        <w:tc>
-          <w:tcPr>
-            <w:tcW w:type="dxa" w:w="1704"/>
-          </w:tcPr>
-          <w:p>
-            <w:r>
-              <w:t>4</w:t>
-            </w:r>
-          </w:p>
-        </w:tc>
-        <w:tc>
-          <w:tcPr>
-            <w:tcW w:type="dxa" w:w="1704"/>
-          </w:tcPr>
-          <w:p>
-            <w:r>
-              <w:t>3</w:t>
-            </w:r>
-          </w:p>
-        </w:tc>
-        <w:tc>
-          <w:tcPr>
-            <w:tcW w:type="dxa" w:w="1704"/>
-          </w:tcPr>
-          <w:p>
-            <w:r>
-              <w:t>Guardian Talent</w:t>
-            </w:r>
-          </w:p>
-        </w:tc>
-        <w:tc>
-          <w:tcPr>
-            <w:tcW w:type="dxa" w:w="1704"/>
-          </w:tcPr>
-          <w:p>
-            <w:r>
-              <w:t>+0</w:t>
-            </w:r>
-          </w:p>
-        </w:tc>
-        <w:tc>
-          <w:tcPr>
-            <w:tcW w:type="dxa" w:w="1704"/>
-          </w:tcPr>
-          <w:p>
-            <w:r>
-              <w:t>4</w:t>
-            </w:r>
-          </w:p>
-        </w:tc>
-        <w:tc>
-          <w:tcPr>
-            <w:tcW w:type="dxa" w:w="1704"/>
-          </w:tcPr>
-          <w:p>
-            <w:r>
-              <w:t>4</w:t>
-            </w:r>
-          </w:p>
-        </w:tc>
-      </w:tr>
-      <w:tr>
-        <w:tc>
-          <w:tcPr>
-            <w:tcW w:type="dxa" w:w="1704"/>
-          </w:tcPr>
-          <w:p>
-            <w:r>
-              <w:t>5</w:t>
-            </w:r>
-          </w:p>
-        </w:tc>
-        <w:tc>
-          <w:tcPr>
-            <w:tcW w:type="dxa" w:w="1704"/>
-          </w:tcPr>
-          <w:p>
-            <w:r>
-              <w:t>3</w:t>
-            </w:r>
-          </w:p>
-        </w:tc>
-        <w:tc>
-          <w:tcPr>
-            <w:tcW w:type="dxa" w:w="1704"/>
-          </w:tcPr>
-          <w:p>
-            <w:r>
-              <w:t>—</w:t>
-            </w:r>
-          </w:p>
-        </w:tc>
-        <w:tc>
-          <w:tcPr>
-            <w:tcW w:type="dxa" w:w="1704"/>
-          </w:tcPr>
-          <w:p>
-            <w:r>
-              <w:t>+2</w:t>
-            </w:r>
-          </w:p>
-        </w:tc>
-        <w:tc>
-          <w:tcPr>
-            <w:tcW w:type="dxa" w:w="1704"/>
-          </w:tcPr>
-          <w:p>
-            <w:r>
-              <w:t>4</w:t>
-            </w:r>
-          </w:p>
-        </w:tc>
-        <w:tc>
-          <w:tcPr>
-            <w:tcW w:type="dxa" w:w="1704"/>
-          </w:tcPr>
-          <w:p>
-            <w:r>
-              <w:t>4</w:t>
-            </w:r>
-          </w:p>
-        </w:tc>
-      </w:tr>
-      <w:tr>
-        <w:tc>
-          <w:tcPr>
-            <w:tcW w:type="dxa" w:w="1704"/>
-          </w:tcPr>
-          <w:p>
-            <w:r>
-              <w:t>6</w:t>
-            </w:r>
-          </w:p>
-        </w:tc>
-        <w:tc>
-          <w:tcPr>
-            <w:tcW w:type="dxa" w:w="1704"/>
-          </w:tcPr>
-          <w:p>
-            <w:r>
-              <w:t>4</w:t>
-            </w:r>
-          </w:p>
-        </w:tc>
-        <w:tc>
-          <w:tcPr>
-            <w:tcW w:type="dxa" w:w="1704"/>
-          </w:tcPr>
-          <w:p>
-            <w:r>
-              <w:t>Guardian Talent</w:t>
-            </w:r>
-          </w:p>
-        </w:tc>
-        <w:tc>
-          <w:tcPr>
-            <w:tcW w:type="dxa" w:w="1704"/>
-          </w:tcPr>
-          <w:p>
-            <w:r>
-              <w:t>+2</w:t>
-            </w:r>
-          </w:p>
-        </w:tc>
-        <w:tc>
-          <w:tcPr>
-            <w:tcW w:type="dxa" w:w="1704"/>
-          </w:tcPr>
-          <w:p>
-            <w:r>
-              <w:t>5</w:t>
-            </w:r>
-          </w:p>
-        </w:tc>
-        <w:tc>
-          <w:tcPr>
-            <w:tcW w:type="dxa" w:w="1704"/>
-          </w:tcPr>
-          <w:p>
-            <w:r>
-              <w:t>5</w:t>
-            </w:r>
-          </w:p>
-        </w:tc>
-      </w:tr>
-      <w:tr>
-        <w:tc>
-          <w:tcPr>
-            <w:tcW w:type="dxa" w:w="1704"/>
-          </w:tcPr>
-          <w:p>
-            <w:r>
-              <w:t>7</w:t>
-            </w:r>
-          </w:p>
-        </w:tc>
-        <w:tc>
-          <w:tcPr>
-            <w:tcW w:type="dxa" w:w="1704"/>
-          </w:tcPr>
-          <w:p>
-            <w:r>
-              <w:t>5</w:t>
-            </w:r>
-          </w:p>
-        </w:tc>
-        <w:tc>
-          <w:tcPr>
-            <w:tcW w:type="dxa" w:w="1704"/>
-          </w:tcPr>
-          <w:p>
-            <w:r>
-              <w:t>—</w:t>
-            </w:r>
-          </w:p>
-        </w:tc>
-        <w:tc>
-          <w:tcPr>
-            <w:tcW w:type="dxa" w:w="1704"/>
-          </w:tcPr>
-          <w:p>
-            <w:r>
-              <w:t>+2</w:t>
-            </w:r>
-          </w:p>
-        </w:tc>
-        <w:tc>
-          <w:tcPr>
-            <w:tcW w:type="dxa" w:w="1704"/>
-          </w:tcPr>
-          <w:p>
-            <w:r>
-              <w:t>5</w:t>
-            </w:r>
-          </w:p>
-        </w:tc>
-        <w:tc>
-          <w:tcPr>
-            <w:tcW w:type="dxa" w:w="1704"/>
-          </w:tcPr>
-          <w:p>
-            <w:r>
-              <w:t>5</w:t>
-            </w:r>
-          </w:p>
-        </w:tc>
-      </w:tr>
-      <w:tr>
-        <w:tc>
-          <w:tcPr>
-            <w:tcW w:type="dxa" w:w="1704"/>
-          </w:tcPr>
-          <w:p>
-            <w:r>
-              <w:t>8</w:t>
-            </w:r>
-          </w:p>
-        </w:tc>
-        <w:tc>
-          <w:tcPr>
-            <w:tcW w:type="dxa" w:w="1704"/>
-          </w:tcPr>
-          <w:p>
-            <w:r>
-              <w:t>6</w:t>
-            </w:r>
-          </w:p>
-        </w:tc>
-        <w:tc>
-          <w:tcPr>
-            <w:tcW w:type="dxa" w:w="1704"/>
-          </w:tcPr>
-          <w:p>
-            <w:r>
-              <w:t>Guardian Talent</w:t>
-            </w:r>
-          </w:p>
-        </w:tc>
-        <w:tc>
-          <w:tcPr>
-            <w:tcW w:type="dxa" w:w="1704"/>
-          </w:tcPr>
-          <w:p>
-            <w:r>
-              <w:t>+2</w:t>
-            </w:r>
-          </w:p>
-        </w:tc>
-        <w:tc>
-          <w:tcPr>
-            <w:tcW w:type="dxa" w:w="1704"/>
-          </w:tcPr>
-          <w:p>
-            <w:r>
-              <w:t>6</w:t>
-            </w:r>
-          </w:p>
-        </w:tc>
-        <w:tc>
-          <w:tcPr>
-            <w:tcW w:type="dxa" w:w="1704"/>
-          </w:tcPr>
-          <w:p>
-            <w:r>
-              <w:t>6</w:t>
-            </w:r>
-          </w:p>
-        </w:tc>
-      </w:tr>
-      <w:tr>
-        <w:tc>
-          <w:tcPr>
-            <w:tcW w:type="dxa" w:w="1704"/>
-          </w:tcPr>
-          <w:p>
-            <w:r>
-              <w:t>9</w:t>
-            </w:r>
-          </w:p>
-        </w:tc>
-        <w:tc>
-          <w:tcPr>
-            <w:tcW w:type="dxa" w:w="1704"/>
-          </w:tcPr>
-          <w:p>
-            <w:r>
-              <w:t>6</w:t>
-            </w:r>
-          </w:p>
-        </w:tc>
-        <w:tc>
-          <w:tcPr>
-            <w:tcW w:type="dxa" w:w="1704"/>
-          </w:tcPr>
-          <w:p>
-            <w:r>
-              <w:t>—</w:t>
-            </w:r>
-          </w:p>
-        </w:tc>
-        <w:tc>
-          <w:tcPr>
-            <w:tcW w:type="dxa" w:w="1704"/>
-          </w:tcPr>
-          <w:p>
-            <w:r>
-              <w:t>+4</w:t>
-            </w:r>
-          </w:p>
-        </w:tc>
-        <w:tc>
-          <w:tcPr>
-            <w:tcW w:type="dxa" w:w="1704"/>
-          </w:tcPr>
-          <w:p>
-            <w:r>
-              <w:t>6</w:t>
-            </w:r>
-          </w:p>
-        </w:tc>
-        <w:tc>
-          <w:tcPr>
-            <w:tcW w:type="dxa" w:w="1704"/>
-          </w:tcPr>
-          <w:p>
-            <w:r>
-              <w:t>6</w:t>
-            </w:r>
-          </w:p>
-        </w:tc>
-      </w:tr>
-      <w:tr>
-        <w:tc>
-          <w:tcPr>
-            <w:tcW w:type="dxa" w:w="1704"/>
-          </w:tcPr>
-          <w:p>
-            <w:r>
-              <w:t>10</w:t>
-            </w:r>
-          </w:p>
-        </w:tc>
-        <w:tc>
-          <w:tcPr>
-            <w:tcW w:type="dxa" w:w="1704"/>
-          </w:tcPr>
-          <w:p>
-            <w:r>
-              <w:t>7</w:t>
-            </w:r>
-          </w:p>
-        </w:tc>
-        <w:tc>
-          <w:tcPr>
-            <w:tcW w:type="dxa" w:w="1704"/>
-          </w:tcPr>
-          <w:p>
-            <w:r>
-              <w:t>Guardian Talent</w:t>
-            </w:r>
-          </w:p>
-        </w:tc>
-        <w:tc>
-          <w:tcPr>
-            <w:tcW w:type="dxa" w:w="1704"/>
-          </w:tcPr>
-          <w:p>
-            <w:r>
-              <w:t>+4</w:t>
-            </w:r>
-          </w:p>
-        </w:tc>
-        <w:tc>
-          <w:tcPr>
-            <w:tcW w:type="dxa" w:w="1704"/>
-          </w:tcPr>
-          <w:p>
-            <w:r>
-              <w:t>7</w:t>
-            </w:r>
-          </w:p>
-        </w:tc>
-        <w:tc>
-          <w:tcPr>
-            <w:tcW w:type="dxa" w:w="1704"/>
-          </w:tcPr>
-          <w:p>
-            <w:r>
-              <w:t>7</w:t>
-            </w:r>
-          </w:p>
-        </w:tc>
-      </w:tr>
-      <w:tr>
-        <w:tc>
-          <w:tcPr>
-            <w:tcW w:type="dxa" w:w="1704"/>
-          </w:tcPr>
-          <w:p>
-            <w:r>
-              <w:t>11</w:t>
-            </w:r>
-          </w:p>
-        </w:tc>
-        <w:tc>
-          <w:tcPr>
-            <w:tcW w:type="dxa" w:w="1704"/>
-          </w:tcPr>
-          <w:p>
-            <w:r>
-              <w:t>8</w:t>
-            </w:r>
-          </w:p>
-        </w:tc>
-        <w:tc>
-          <w:tcPr>
-            <w:tcW w:type="dxa" w:w="1704"/>
-          </w:tcPr>
-          <w:p>
-            <w:r>
-              <w:t>—</w:t>
-            </w:r>
-          </w:p>
-        </w:tc>
-        <w:tc>
-          <w:tcPr>
-            <w:tcW w:type="dxa" w:w="1704"/>
-          </w:tcPr>
-          <w:p>
-            <w:r>
-              <w:t>+4</w:t>
-            </w:r>
-          </w:p>
-        </w:tc>
-        <w:tc>
-          <w:tcPr>
-            <w:tcW w:type="dxa" w:w="1704"/>
-          </w:tcPr>
-          <w:p>
-            <w:r>
-              <w:t>7</w:t>
-            </w:r>
-          </w:p>
-        </w:tc>
-        <w:tc>
-          <w:tcPr>
-            <w:tcW w:type="dxa" w:w="1704"/>
-          </w:tcPr>
-          <w:p>
-            <w:r>
-              <w:t>7</w:t>
-            </w:r>
-          </w:p>
-        </w:tc>
-      </w:tr>
-      <w:tr>
-        <w:tc>
-          <w:tcPr>
-            <w:tcW w:type="dxa" w:w="1704"/>
-          </w:tcPr>
-          <w:p>
-            <w:r>
-              <w:t>12</w:t>
-            </w:r>
-          </w:p>
-        </w:tc>
-        <w:tc>
-          <w:tcPr>
-            <w:tcW w:type="dxa" w:w="1704"/>
-          </w:tcPr>
-          <w:p>
-            <w:r>
-              <w:t>9</w:t>
-            </w:r>
-          </w:p>
-        </w:tc>
-        <w:tc>
-          <w:tcPr>
-            <w:tcW w:type="dxa" w:w="1704"/>
-          </w:tcPr>
-          <w:p>
-            <w:r>
-              <w:t>Guardian Talent</w:t>
-            </w:r>
-          </w:p>
-        </w:tc>
-        <w:tc>
-          <w:tcPr>
-            <w:tcW w:type="dxa" w:w="1704"/>
-          </w:tcPr>
-          <w:p>
-            <w:r>
-              <w:t>+4</w:t>
-            </w:r>
-          </w:p>
-        </w:tc>
-        <w:tc>
-          <w:tcPr>
-            <w:tcW w:type="dxa" w:w="1704"/>
-          </w:tcPr>
-          <w:p>
-            <w:r>
-              <w:t>8</w:t>
-            </w:r>
-          </w:p>
-        </w:tc>
-        <w:tc>
-          <w:tcPr>
-            <w:tcW w:type="dxa" w:w="1704"/>
-          </w:tcPr>
-          <w:p>
-            <w:r>
-              <w:t>8</w:t>
-            </w:r>
-          </w:p>
-        </w:tc>
-      </w:tr>
-      <w:tr>
-        <w:tc>
-          <w:tcPr>
-            <w:tcW w:type="dxa" w:w="1704"/>
-          </w:tcPr>
-          <w:p>
-            <w:r>
-              <w:t>13</w:t>
-            </w:r>
-          </w:p>
-        </w:tc>
-        <w:tc>
-          <w:tcPr>
-            <w:tcW w:type="dxa" w:w="1704"/>
-          </w:tcPr>
-          <w:p>
-            <w:r>
-              <w:t>9</w:t>
-            </w:r>
-          </w:p>
-        </w:tc>
-        <w:tc>
-          <w:tcPr>
-            <w:tcW w:type="dxa" w:w="1704"/>
-          </w:tcPr>
-          <w:p>
-            <w:r>
-              <w:t>—</w:t>
-            </w:r>
-          </w:p>
-        </w:tc>
-        <w:tc>
-          <w:tcPr>
-            <w:tcW w:type="dxa" w:w="1704"/>
-          </w:tcPr>
-          <w:p>
-            <w:r>
-              <w:t>+6</w:t>
-            </w:r>
-          </w:p>
-        </w:tc>
-        <w:tc>
-          <w:tcPr>
-            <w:tcW w:type="dxa" w:w="1704"/>
-          </w:tcPr>
-          <w:p>
-            <w:r>
-              <w:t>8</w:t>
-            </w:r>
-          </w:p>
-        </w:tc>
-        <w:tc>
-          <w:tcPr>
-            <w:tcW w:type="dxa" w:w="1704"/>
-          </w:tcPr>
-          <w:p>
-            <w:r>
-              <w:t>8</w:t>
-            </w:r>
-          </w:p>
-        </w:tc>
-      </w:tr>
-      <w:tr>
-        <w:tc>
-          <w:tcPr>
-            <w:tcW w:type="dxa" w:w="1704"/>
-          </w:tcPr>
-          <w:p>
-            <w:r>
-              <w:t>14</w:t>
-            </w:r>
-          </w:p>
-        </w:tc>
-        <w:tc>
-          <w:tcPr>
-            <w:tcW w:type="dxa" w:w="1704"/>
-          </w:tcPr>
-          <w:p>
-            <w:r>
-              <w:t>10</w:t>
-            </w:r>
-          </w:p>
-        </w:tc>
-        <w:tc>
-          <w:tcPr>
-            <w:tcW w:type="dxa" w:w="1704"/>
-          </w:tcPr>
-          <w:p>
-            <w:r>
-              <w:t>Guardian Talent</w:t>
-            </w:r>
-          </w:p>
-        </w:tc>
-        <w:tc>
-          <w:tcPr>
-            <w:tcW w:type="dxa" w:w="1704"/>
-          </w:tcPr>
-          <w:p>
-            <w:r>
-              <w:t>+6</w:t>
-            </w:r>
-          </w:p>
-        </w:tc>
-        <w:tc>
-          <w:tcPr>
-            <w:tcW w:type="dxa" w:w="1704"/>
-          </w:tcPr>
-          <w:p>
-            <w:r>
-              <w:t>9</w:t>
-            </w:r>
-          </w:p>
-        </w:tc>
-        <w:tc>
-          <w:tcPr>
-            <w:tcW w:type="dxa" w:w="1704"/>
-          </w:tcPr>
-          <w:p>
-            <w:r>
-              <w:t>9</w:t>
-            </w:r>
-          </w:p>
-        </w:tc>
-      </w:tr>
-      <w:tr>
-        <w:tc>
-          <w:tcPr>
-            <w:tcW w:type="dxa" w:w="1704"/>
-          </w:tcPr>
-          <w:p>
-            <w:r>
-              <w:t>15</w:t>
-            </w:r>
-          </w:p>
-        </w:tc>
-        <w:tc>
-          <w:tcPr>
-            <w:tcW w:type="dxa" w:w="1704"/>
-          </w:tcPr>
-          <w:p>
-            <w:r>
-              <w:t>11</w:t>
-            </w:r>
-          </w:p>
-        </w:tc>
-        <w:tc>
-          <w:tcPr>
-            <w:tcW w:type="dxa" w:w="1704"/>
-          </w:tcPr>
-          <w:p>
-            <w:r>
-              <w:t>—</w:t>
-            </w:r>
-          </w:p>
-        </w:tc>
-        <w:tc>
-          <w:tcPr>
-            <w:tcW w:type="dxa" w:w="1704"/>
-          </w:tcPr>
-          <w:p>
-            <w:r>
-              <w:t>+6</w:t>
-            </w:r>
-          </w:p>
-        </w:tc>
-        <w:tc>
-          <w:tcPr>
-            <w:tcW w:type="dxa" w:w="1704"/>
-          </w:tcPr>
-          <w:p>
-            <w:r>
-              <w:t>9</w:t>
-            </w:r>
-          </w:p>
-        </w:tc>
-        <w:tc>
-          <w:tcPr>
-            <w:tcW w:type="dxa" w:w="1704"/>
-          </w:tcPr>
-          <w:p>
-            <w:r>
-              <w:t>9</w:t>
-            </w:r>
-          </w:p>
-        </w:tc>
-      </w:tr>
-      <w:tr>
-        <w:tc>
-          <w:tcPr>
-            <w:tcW w:type="dxa" w:w="1704"/>
-          </w:tcPr>
-          <w:p>
-            <w:r>
-              <w:t>16</w:t>
-            </w:r>
-          </w:p>
-        </w:tc>
-        <w:tc>
-          <w:tcPr>
-            <w:tcW w:type="dxa" w:w="1704"/>
-          </w:tcPr>
-          <w:p>
-            <w:r>
-              <w:t>12</w:t>
-            </w:r>
-          </w:p>
-        </w:tc>
-        <w:tc>
-          <w:tcPr>
-            <w:tcW w:type="dxa" w:w="1704"/>
-          </w:tcPr>
-          <w:p>
-            <w:r>
-              <w:t>Guardian Talent</w:t>
-            </w:r>
-          </w:p>
-        </w:tc>
-        <w:tc>
-          <w:tcPr>
-            <w:tcW w:type="dxa" w:w="1704"/>
-          </w:tcPr>
-          <w:p>
-            <w:r>
-              <w:t>+6</w:t>
-            </w:r>
-          </w:p>
-        </w:tc>
-        <w:tc>
-          <w:tcPr>
-            <w:tcW w:type="dxa" w:w="1704"/>
-          </w:tcPr>
-          <w:p>
-            <w:r>
-              <w:t>10</w:t>
-            </w:r>
-          </w:p>
-        </w:tc>
-        <w:tc>
-          <w:tcPr>
-            <w:tcW w:type="dxa" w:w="1704"/>
-          </w:tcPr>
-          <w:p>
-            <w:r>
-              <w:t>10</w:t>
-            </w:r>
-          </w:p>
-        </w:tc>
-      </w:tr>
-      <w:tr>
-        <w:tc>
-          <w:tcPr>
-            <w:tcW w:type="dxa" w:w="1704"/>
-          </w:tcPr>
-          <w:p>
-            <w:r>
-              <w:t>17</w:t>
-            </w:r>
-          </w:p>
-        </w:tc>
-        <w:tc>
-          <w:tcPr>
-            <w:tcW w:type="dxa" w:w="1704"/>
-          </w:tcPr>
-          <w:p>
-            <w:r>
-              <w:t>12</w:t>
-            </w:r>
-          </w:p>
-        </w:tc>
-        <w:tc>
-          <w:tcPr>
-            <w:tcW w:type="dxa" w:w="1704"/>
-          </w:tcPr>
-          <w:p>
-            <w:r>
-              <w:t>—</w:t>
-            </w:r>
-          </w:p>
-        </w:tc>
-        <w:tc>
-          <w:tcPr>
-            <w:tcW w:type="dxa" w:w="1704"/>
-          </w:tcPr>
-          <w:p>
-            <w:r>
-              <w:t>+8</w:t>
-            </w:r>
-          </w:p>
-        </w:tc>
-        <w:tc>
-          <w:tcPr>
-            <w:tcW w:type="dxa" w:w="1704"/>
-          </w:tcPr>
-          <w:p>
-            <w:r>
-              <w:t>10</w:t>
-            </w:r>
-          </w:p>
-        </w:tc>
-        <w:tc>
-          <w:tcPr>
-            <w:tcW w:type="dxa" w:w="1704"/>
-          </w:tcPr>
-          <w:p>
-            <w:r>
-              <w:t>10</w:t>
-            </w:r>
-          </w:p>
-        </w:tc>
-      </w:tr>
-      <w:tr>
-        <w:tc>
-          <w:tcPr>
-            <w:tcW w:type="dxa" w:w="1704"/>
-          </w:tcPr>
-          <w:p>
-            <w:r>
-              <w:t>18</w:t>
-            </w:r>
-          </w:p>
-        </w:tc>
-        <w:tc>
-          <w:tcPr>
-            <w:tcW w:type="dxa" w:w="1704"/>
-          </w:tcPr>
-          <w:p>
-            <w:r>
-              <w:t>13</w:t>
-            </w:r>
-          </w:p>
-        </w:tc>
-        <w:tc>
-          <w:tcPr>
-            <w:tcW w:type="dxa" w:w="1704"/>
-          </w:tcPr>
-          <w:p>
-            <w:r>
-              <w:t>Guardian Talent</w:t>
-            </w:r>
-          </w:p>
-        </w:tc>
-        <w:tc>
-          <w:tcPr>
-            <w:tcW w:type="dxa" w:w="1704"/>
-          </w:tcPr>
-          <w:p>
-            <w:r>
-              <w:t>+8</w:t>
-            </w:r>
-          </w:p>
-        </w:tc>
-        <w:tc>
-          <w:tcPr>
-            <w:tcW w:type="dxa" w:w="1704"/>
-          </w:tcPr>
-          <w:p>
-            <w:r>
-              <w:t>11</w:t>
-            </w:r>
-          </w:p>
-        </w:tc>
-        <w:tc>
-          <w:tcPr>
-            <w:tcW w:type="dxa" w:w="1704"/>
-          </w:tcPr>
-          <w:p>
-            <w:r>
-              <w:t>11</w:t>
-            </w:r>
-          </w:p>
-        </w:tc>
-      </w:tr>
-      <w:tr>
-        <w:tc>
-          <w:tcPr>
-            <w:tcW w:type="dxa" w:w="1704"/>
-          </w:tcPr>
-          <w:p>
-            <w:r>
-              <w:t>19</w:t>
-            </w:r>
-          </w:p>
-        </w:tc>
-        <w:tc>
-          <w:tcPr>
-            <w:tcW w:type="dxa" w:w="1704"/>
-          </w:tcPr>
-          <w:p>
-            <w:r>
-              <w:t>14</w:t>
-            </w:r>
-          </w:p>
-        </w:tc>
-        <w:tc>
-          <w:tcPr>
-            <w:tcW w:type="dxa" w:w="1704"/>
-          </w:tcPr>
-          <w:p>
-            <w:r>
-              <w:t>—</w:t>
-            </w:r>
-          </w:p>
-        </w:tc>
-        <w:tc>
-          <w:tcPr>
-            <w:tcW w:type="dxa" w:w="1704"/>
-          </w:tcPr>
-          <w:p>
-            <w:r>
-              <w:t>+8</w:t>
-            </w:r>
-          </w:p>
-        </w:tc>
-        <w:tc>
-          <w:tcPr>
-            <w:tcW w:type="dxa" w:w="1704"/>
-          </w:tcPr>
-          <w:p>
-            <w:r>
-              <w:t>11</w:t>
-            </w:r>
-          </w:p>
-        </w:tc>
-        <w:tc>
-          <w:tcPr>
-            <w:tcW w:type="dxa" w:w="1704"/>
-          </w:tcPr>
-          <w:p>
-            <w:r>
-              <w:t>11</w:t>
-            </w:r>
-          </w:p>
-        </w:tc>
-      </w:tr>
-      <w:tr>
-        <w:tc>
-          <w:tcPr>
-            <w:tcW w:type="dxa" w:w="1704"/>
-          </w:tcPr>
-          <w:p>
-            <w:r>
-              <w:t>20</w:t>
-            </w:r>
-          </w:p>
-        </w:tc>
-        <w:tc>
-          <w:tcPr>
-            <w:tcW w:type="dxa" w:w="1704"/>
-          </w:tcPr>
-          <w:p>
-            <w:r>
-              <w:t>15</w:t>
-            </w:r>
-          </w:p>
-        </w:tc>
-        <w:tc>
-          <w:tcPr>
-            <w:tcW w:type="dxa" w:w="1704"/>
-          </w:tcPr>
-          <w:p>
-            <w:r>
-              <w:t>—</w:t>
-            </w:r>
-          </w:p>
-        </w:tc>
-        <w:tc>
-          <w:tcPr>
-            <w:tcW w:type="dxa" w:w="1704"/>
-          </w:tcPr>
-          <w:p>
-            <w:r>
-              <w:t>+8</w:t>
-            </w:r>
-          </w:p>
-        </w:tc>
-        <w:tc>
-          <w:tcPr>
-            <w:tcW w:type="dxa" w:w="1704"/>
-          </w:tcPr>
-          <w:p>
-            <w:r>
-              <w:t>12</w:t>
-            </w:r>
-          </w:p>
-        </w:tc>
-        <w:tc>
-          <w:tcPr>
-            <w:tcW w:type="dxa" w:w="1704"/>
-          </w:tcPr>
-          <w:p>
-            <w:r>
-              <w:t>12</w:t>
-            </w:r>
-          </w:p>
-        </w:tc>
-      </w:tr>
-    </w:tbl>
+        <w:t>Resonance</w:t>
+      </w:r>
+    </w:p>
+    <w:p>
+      <w:r>
+        <w:t>Requirement: Must resonate with an individual or complete a significant bonding event.</w:t>
+      </w:r>
+    </w:p>
+    <w:p>
+      <w:r>
+        <w:t>The Guardian forms a spiritual connection with a significant individual, allowing the Guardian's user to gain an additional Guardian. This Guardian is added to the user's reserve and follows all normal rules for reserve and active Guardians. The process of Resonance requires a ritual or shared experience with the bonded individual, as determined by the GM.</w:t>
+      </w:r>
+    </w:p>
+    <w:p>
+      <w:pPr>
+        <w:pStyle w:val="Heading3"/>
+      </w:pPr>
+      <w:r>
+        <w:t>Translator</w:t>
+      </w:r>
+    </w:p>
+    <w:p>
+      <w:r>
+        <w:t>The Guardian's knowledge extends to languages, allowing its user to gain fluency in two additional languages. These languages must be selected from those commonly available in the campaign world or granted at the GM's discretion based on the Guardian's nature or origin.</w:t>
+      </w:r>
+    </w:p>
+    <w:p>
+      <w:pPr>
+        <w:pStyle w:val="Heading3"/>
+      </w:pPr>
+      <w:r>
+        <w:t>Tengu's Expertise</w:t>
+      </w:r>
+    </w:p>
+    <w:p>
+      <w:r>
+        <w:t>The Guardian imparts expertise in weaponry, allowing the user to wield any weapon they pick up with ease. The user gains proficiency with any weapon they wield for 24 hours, as long as they are in possession of the Guardian. This does not grant access to special abilities tied to specific class features, such as fighter weapon training.</w:t>
+      </w:r>
+    </w:p>
+    <w:p>
+      <w:pPr>
+        <w:pStyle w:val="Heading3"/>
+      </w:pPr>
+      <w:r>
+        <w:t>Guardian Weapon</w:t>
+      </w:r>
+    </w:p>
+    <w:p>
+      <w:r>
+        <w:t>The Guardian manifests an independent spiritual weapon tied to its essence. This weapon appears in the user's hand or at their side — it is not an augment or enchantment applied to an existing weapon. The manifested weapon is treated as a +1 magical weapon and scales with the Guardian's Hit Dice: At 5 HD: +2 magical weapon. At 10 HD: +3 magical weapon. At 15 HD: +4 magical weapon. At 20 HD: +5 magical weapon. The weapon's form is chosen when the talent is selected (e.g., a sword, staff, or bow) and cannot be changed afterward. The weapon exists only while the Guardian is active and disappears if the Guardian is switched to reserve.</w:t>
+      </w:r>
+    </w:p>
+    <w:p>
+      <w:pPr>
+        <w:pStyle w:val="Heading3"/>
+      </w:pPr>
+      <w:r>
+        <w:t>Guardian Magic</w:t>
+      </w:r>
+    </w:p>
+    <w:p>
+      <w:r>
+        <w:t>The Guardian grants access to limited spellcasting, but only for self-targeted effects. The user can cast spells granted by the Guardian as if they were spell-like abilities. At 3 HD: Choose two 1st-level self-targeting spells. At 6 HD: Add one 2nd-level self-targeting spell. At 9 HD: Add one 3rd-level self-targeting spell. Spells can be used a total number of times per day equal to the user's Charisma modifier, divided among all known spells.</w:t>
+      </w:r>
+    </w:p>
+    <w:p>
+      <w:pPr>
+        <w:pStyle w:val="Heading3"/>
+      </w:pPr>
+      <w:r>
+        <w:t>Guardian's Instincts</w:t>
+      </w:r>
+    </w:p>
+    <w:p>
+      <w:r>
+        <w:t>The Guardian sharpens the user's senses, granting them heightened awareness. The user gains: +2 bonus on Perception checks to detect hidden enemies, traps, and dangers; the ability to sense the presence of traps within 30 feet as if using the spell detect traps. At 10 Guardian Hit Dice, the user gains blindsense out to 10 feet.</w:t>
+      </w:r>
+    </w:p>
+    <w:p>
+      <w:pPr>
+        <w:pStyle w:val="Heading3"/>
+      </w:pPr>
+      <w:r>
+        <w:t>Spirit-Boosted Body</w:t>
+      </w:r>
+    </w:p>
+    <w:p>
+      <w:r>
+        <w:t>The Guardian enhances the user's vitality, granting them temporary hit points equal to half the Guardian's total Hit Dice. These temporary hit points are refreshed whenever the Guardian is summoned or switched from reserve to active.</w:t>
+      </w:r>
+    </w:p>
+    <w:p>
+      <w:pPr>
+        <w:pStyle w:val="Heading3"/>
+      </w:pPr>
+      <w:r>
+        <w:t>Grace</w:t>
+      </w:r>
+    </w:p>
+    <w:p>
+      <w:r>
+        <w:t>The Guardian channels its spiritual energy into the user, granting them a +4 enhancement bonus to Charisma and a +2 enhancement bonus to either Intelligence or Wisdom (chosen when the talent is selected). These bonuses increase by +2 and +1, respectively, for every 5 Guardian Hit Dice.</w:t>
+      </w:r>
+    </w:p>
+    <w:p>
+      <w:pPr>
+        <w:pStyle w:val="Heading3"/>
+      </w:pPr>
+      <w:r>
+        <w:t>Born of Oath</w:t>
+      </w:r>
+    </w:p>
+    <w:p>
+      <w:r>
+        <w:t>The user gains one additional Guardian reserve slot. This slot follows all normal rules for reserve Guardians.</w:t>
+      </w:r>
+    </w:p>
+    <w:p>
+      <w:pPr>
+        <w:pStyle w:val="Heading3"/>
+      </w:pPr>
+      <w:r>
+        <w:t>Awareness</w:t>
+      </w:r>
+    </w:p>
+    <w:p>
+      <w:r>
+        <w:t>The Guardian's user gains the benefits of a familiar. This includes the Alertness feat while the Guardian is active, as well as an increase to Perception and Reflex saves by +2. The user also gains access to the Guardian's enhanced senses, such as Darkvision (if the Guardian has it).</w:t>
+      </w:r>
+    </w:p>
+    <w:p>
+      <w:pPr>
+        <w:pStyle w:val="Heading3"/>
+      </w:pPr>
+      <w:r>
+        <w:t>Extra Infusion</w:t>
+      </w:r>
+    </w:p>
+    <w:p>
+      <w:r>
+        <w:t>You learn one additional infusion from the Infusion list. You may select this talent multiple times. Each time, you learn a different infusion.</w:t>
+      </w:r>
+    </w:p>
+    <w:p>
+      <w:pPr>
+        <w:pStyle w:val="Heading3"/>
+      </w:pPr>
+      <w:r>
+        <w:t>Rapid Installation</w:t>
+      </w:r>
+    </w:p>
+    <w:p>
+      <w:r>
+        <w:t>You may apply an infusion as a move action instead of a standard action. At 10 Guardian Hit Dice, once per encounter, you may apply an infusion as a swift action.</w:t>
+      </w:r>
+    </w:p>
+    <w:p>
+      <w:pPr>
+        <w:pStyle w:val="Heading3"/>
+      </w:pPr>
+      <w:r>
+        <w:t>Emergency Patch</w:t>
+      </w:r>
+    </w:p>
+    <w:p>
+      <w:r>
+        <w:t>Once per encounter, as an immediate action, you may apply one known infusion to yourself or an adjacent willing ally. The infusion must be Bolstering Infusion, Rejuvenating Infusion, Revitalizing Infusion, Angelic Infusion, Focusing Infusion, or another defensive infusion approved by the GM. An infusion applied this way lasts for 1 round per Guardian Hit Die unless its normal duration would be shorter.</w:t>
+      </w:r>
+    </w:p>
+    <w:p>
+      <w:pPr>
+        <w:pStyle w:val="Heading3"/>
+      </w:pPr>
+      <w:r>
+        <w:t>Twin Installation</w:t>
+      </w:r>
+    </w:p>
+    <w:p>
+      <w:r>
+        <w:t>When you apply an infusion, you may apply a second infusion as part of the same action. Both infusions must be applied to the same target or to two targets you can touch. If both infusions would normally require a standard action, applying both becomes a full-round action. Each infusion counts normally against the target’s infusion capacity.</w:t>
+      </w:r>
+    </w:p>
+    <w:p>
+      <w:pPr>
+        <w:pStyle w:val="Heading3"/>
+      </w:pPr>
+      <w:r>
+        <w:t>Bulk Calibration</w:t>
+      </w:r>
+    </w:p>
+    <w:p>
+      <w:r>
+        <w:t>When using Bulk Infusion, increase the number of targets you may affect by your key ability modifier, minimum +1. At 10 Guardian Hit Dice, each target affected by your Bulk Infusion may also receive one additional infusion, provided this does not exceed the target’s infusion capacity.</w:t>
+      </w:r>
+    </w:p>
+    <w:p>
+      <w:pPr>
+        <w:pStyle w:val="Heading3"/>
+      </w:pPr>
+      <w:r>
+        <w:t>Lingering Installation</w:t>
+      </w:r>
+    </w:p>
+    <w:p>
+      <w:r>
+        <w:t>When you switch away from Infusion Guardian, choose one active infusion you created. That infusion continues functioning for 1 round per 2 Guardian Hit Dice instead of becoming dormant normally. At 10 Guardian Hit Dice, you may choose two active infusions instead.</w:t>
+      </w:r>
+    </w:p>
+    <w:p>
+      <w:pPr>
+        <w:pStyle w:val="Heading3"/>
+      </w:pPr>
+      <w:r>
+        <w:t>Workshop Memory</w:t>
+      </w:r>
+    </w:p>
+    <w:p>
+      <w:r>
+        <w:t>When you switch back to Infusion Guardian, you may immediately reactivate one dormant infusion you created without spending an action. At 10 Guardian Hit Dice, you may reactivate two dormant infusions instead. Reactivated infusions must still have remaining duration.</w:t>
+      </w:r>
+    </w:p>
+    <w:p>
+      <w:pPr>
+        <w:pStyle w:val="Heading3"/>
+      </w:pPr>
+      <w:r>
+        <w:t>Stable Circuitry</w:t>
+      </w:r>
+    </w:p>
+    <w:p>
+      <w:r>
+        <w:t>Your infusions are difficult to disrupt. Add half your Guardian Hit Dice as a bonus to the DC to dispel your infusions. In addition, when one of your infusions would be suppressed by antimagic or a similar effect, it continues functioning for 1 round before becoming suppressed.</w:t>
+      </w:r>
+    </w:p>
+    <w:p>
+      <w:pPr>
+        <w:pStyle w:val="Heading3"/>
+      </w:pPr>
+      <w:r>
+        <w:t>Efficient Discharge</w:t>
+      </w:r>
+    </w:p>
+    <w:p>
+      <w:r>
+        <w:t>Once per encounter, when one of your infusions would discharge, you may choose for it to remain active. If you do, the discharge effect is halved, and the infusion’s normal passive effect is suppressed until the start of your next turn. An infusion preserved this way cannot discharge again during the same encounter.</w:t>
+      </w:r>
+    </w:p>
+    <w:p>
+      <w:pPr>
+        <w:pStyle w:val="Heading3"/>
+      </w:pPr>
+      <w:r>
+        <w:t>Overclocked Infusion</w:t>
+      </w:r>
+    </w:p>
+    <w:p>
+      <w:r>
+        <w:t>Once per encounter, when you apply or discharge an infusion with a numerical effect, you may overclock it. An overclocked infusion doubles one numerical bonus, damage value, healing value, resistance value, temporary hit point value, or movement value for 1 round. After the overclock ends, the infusion immediately discharges or becomes dormant until the end of the encounter, whichever is worse for the user.</w:t>
+      </w:r>
+    </w:p>
+    <w:p>
+      <w:pPr>
+        <w:pStyle w:val="Heading3"/>
+      </w:pPr>
+      <w:r>
+        <w:t>Field Refit</w:t>
+      </w:r>
+    </w:p>
+    <w:p>
+      <w:r>
+        <w:t>As a move action, you may move one active infusion you created from one willing creature, unattended object, or touched item to another valid target you can touch. The infusion keeps its remaining duration. If the new target is unwilling or the item is attended by an unwilling creature, you must succeed at a melee touch attack, and the target receives any saving throw normally allowed by the infusion.</w:t>
+      </w:r>
+    </w:p>
+    <w:p>
+      <w:pPr>
+        <w:pStyle w:val="Heading3"/>
+      </w:pPr>
+      <w:r>
+        <w:t>Regalia Integration</w:t>
+      </w:r>
+    </w:p>
+    <w:p>
+      <w:r>
+        <w:t>Your infusions synchronize especially well with Regalia, Guardian weapons, and class-bound equipment. When you apply an infusion to your own Regalia component, Guardian Weapon, Regalia staff point, Omni Wrench, bound ship system, construct companion, or similar class-bound item, treat your Guardian Hit Dice as 2 higher for that infusion’s numerical effects and duration. At 10 Guardian Hit Dice, infusions applied to such targets do not count against that target’s infusion capacity for the first infusion only.</w:t>
+      </w:r>
+    </w:p>
     <w:p>
       <w:r>
         <w:br w:type="page"/>
@@ -15051,7 +14012,7 @@
         <w:pStyle w:val="Heading1"/>
       </w:pPr>
       <w:r>
-        <w:t>Infusion Guardian</w:t>
+        <w:t>Editorial Notes</w:t>
       </w:r>
     </w:p>
     <w:p>
@@ -15059,17 +14020,12 @@
         <w:pStyle w:val="Heading3"/>
       </w:pPr>
       <w:r>
-        <w:t>Resonance</w:t>
-      </w:r>
-    </w:p>
-    <w:p>
-      <w:r>
-        <w:t>Requirement: Must resonate with an individual or complete a significant bonding event.</w:t>
-      </w:r>
-    </w:p>
-    <w:p>
-      <w:r>
-        <w:t>The Guardian forms a spiritual connection with a significant individual, allowing the Guardian's user to gain an additional Guardian. This Guardian is added to the user's reserve and follows all normal rules for reserve and active Guardians. The process of Resonance requires a ritual or shared experience with the bonded individual, as determined by the GM.</w:t>
+        <w:t>Source and scope</w:t>
+      </w:r>
+    </w:p>
+    <w:p>
+      <w:r>
+        <w:t>This volume reformats Taoist(done).pdf and Guardian(done).pdf through the complete Infusion Guardian talent section. At the author’s direction, Taoist is a Mid Caster, unnamed Feature and Cap Feature placeholders have been removed, Geomancy Guardian and its reserved table have been removed, and Bound Demon references Night Monarch. Alchemy and Ninja Guardian material falls outside Book 1. Source export furniture and repeated page-break lines have been removed.</w:t>
       </w:r>
     </w:p>
     <w:p>
@@ -15077,12 +14033,12 @@
         <w:pStyle w:val="Heading3"/>
       </w:pPr>
       <w:r>
-        <w:t>Translator</w:t>
-      </w:r>
-    </w:p>
-    <w:p>
-      <w:r>
-        <w:t>The Guardian's knowledge extends to languages, allowing its user to gain fluency in two additional languages. These languages must be selected from those commonly available in the campaign world or granted at the GM's discretion based on the Guardian's nature or origin.</w:t>
+        <w:t>Blended Training</w:t>
+      </w:r>
+    </w:p>
+    <w:p>
+      <w:r>
+        <w:t>Blended Training prose and table differ. Both are retained pending an authorial decision on the intended progression.</w:t>
       </w:r>
     </w:p>
     <w:p>
@@ -15090,12 +14046,12 @@
         <w:pStyle w:val="Heading3"/>
       </w:pPr>
       <w:r>
-        <w:t>Tengu's Expertise</w:t>
-      </w:r>
-    </w:p>
-    <w:p>
-      <w:r>
-        <w:t>The Guardian imparts expertise in weaponry, allowing the user to wield any weapon they pick up with ease. The user gains proficiency with any weapon they wield for 24 hours, as long as they are in possession of the Guardian. This does not grant access to special abilities tied to specific class features, such as fighter weapon training.</w:t>
+        <w:t>Bound Demon dependency</w:t>
+      </w:r>
+    </w:p>
+    <w:p>
+      <w:r>
+        <w:t>The Bound Demon option uses the Night Monarch Echoes progression and Echo Progression Table. Those rules are not included in the source PDFs and have not been reconstructed.</w:t>
       </w:r>
     </w:p>
     <w:p>
@@ -15103,311 +14059,12 @@
         <w:pStyle w:val="Heading3"/>
       </w:pPr>
       <w:r>
-        <w:t>Guardian Weapon</w:t>
-      </w:r>
-    </w:p>
-    <w:p>
-      <w:r>
-        <w:t>The Guardian manifests an independent spiritual weapon tied to its essence. This weapon appears in the user's hand or at their side — it is not an augment or enchantment applied to an existing weapon. The manifested weapon is treated as a +1 magical weapon and scales with the Guardian's Hit Dice: At 5 HD: +2 magical weapon. At 10 HD: +3 magical weapon. At 15 HD: +4 magical weapon. At 20 HD: +5 magical weapon. The weapon's form is chosen when the talent is selected (e.g., a sword, staff, or bow) and cannot be changed afterward. The weapon exists only while the Guardian is active and disappears if the Guardian is switched to reserve.</w:t>
-      </w:r>
-    </w:p>
-    <w:p>
-      <w:pPr>
-        <w:pStyle w:val="Heading3"/>
-      </w:pPr>
-      <w:r>
-        <w:t>Guardian Magic</w:t>
-      </w:r>
-    </w:p>
-    <w:p>
-      <w:r>
-        <w:t>The Guardian grants access to limited spellcasting, but only for self-targeted effects. The user can cast spells granted by the Guardian as if they were spell-like abilities. At 3 HD: Choose two 1st-level self-targeting spells. At 6 HD: Add one 2nd-level self-targeting spell. At 9 HD: Add one 3rd-level self-targeting spell. Spells can be used a total number of times per day equal to the user's Charisma modifier, divided among all known spells.</w:t>
-      </w:r>
-    </w:p>
-    <w:p>
-      <w:pPr>
-        <w:pStyle w:val="Heading3"/>
-      </w:pPr>
-      <w:r>
-        <w:t>Guardian's Instincts</w:t>
-      </w:r>
-    </w:p>
-    <w:p>
-      <w:r>
-        <w:t>The Guardian sharpens the user's senses, granting them heightened awareness. The user gains: +2 bonus on Perception checks to detect hidden enemies, traps, and dangers; the ability to sense the presence of traps within 30 feet as if using the spell detect traps. At 10 Guardian Hit Dice, the user gains blindsense out to 10 feet.</w:t>
-      </w:r>
-    </w:p>
-    <w:p>
-      <w:pPr>
-        <w:pStyle w:val="Heading3"/>
-      </w:pPr>
-      <w:r>
-        <w:t>Spirit-Boosted Body</w:t>
-      </w:r>
-    </w:p>
-    <w:p>
-      <w:r>
-        <w:t>The Guardian enhances the user's vitality, granting them temporary hit points equal to half the Guardian's total Hit Dice. These temporary hit points are refreshed whenever the Guardian is summoned or switched from reserve to active.</w:t>
-      </w:r>
-    </w:p>
-    <w:p>
-      <w:pPr>
-        <w:pStyle w:val="Heading3"/>
-      </w:pPr>
-      <w:r>
-        <w:t>Grace</w:t>
-      </w:r>
-    </w:p>
-    <w:p>
-      <w:r>
-        <w:t>The Guardian channels its spiritual energy into the user, granting them a +4 enhancement bonus to Charisma and a +2 enhancement bonus to either Intelligence or Wisdom (chosen when the talent is selected). These bonuses increase by +2 and +1, respectively, for every 5 Guardian Hit Dice.</w:t>
-      </w:r>
-    </w:p>
-    <w:p>
-      <w:pPr>
-        <w:pStyle w:val="Heading3"/>
-      </w:pPr>
-      <w:r>
-        <w:t>Born of Oath</w:t>
-      </w:r>
-    </w:p>
-    <w:p>
-      <w:r>
-        <w:t>The user gains one additional Guardian reserve slot. This slot follows all normal rules for reserve Guardians.</w:t>
-      </w:r>
-    </w:p>
-    <w:p>
-      <w:pPr>
-        <w:pStyle w:val="Heading3"/>
-      </w:pPr>
-      <w:r>
-        <w:t>Awareness</w:t>
-      </w:r>
-    </w:p>
-    <w:p>
-      <w:r>
-        <w:t>The Guardian's user gains the benefits of a familiar. This includes the Alertness feat while the Guardian is active, as well as an increase to Perception and Reflex saves by +2. The user also gains access to the Guardian's enhanced senses, such as Darkvision (if the Guardian has it).</w:t>
-      </w:r>
-    </w:p>
-    <w:p>
-      <w:pPr>
-        <w:pStyle w:val="Heading3"/>
-      </w:pPr>
-      <w:r>
-        <w:t>Extra Infusion</w:t>
-      </w:r>
-    </w:p>
-    <w:p>
-      <w:r>
-        <w:t>You learn one additional infusion from the Infusion list. You may select this talent multiple times. Each time, you learn a different infusion.</w:t>
-      </w:r>
-    </w:p>
-    <w:p>
-      <w:pPr>
-        <w:pStyle w:val="Heading3"/>
-      </w:pPr>
-      <w:r>
-        <w:t>Rapid Installation</w:t>
-      </w:r>
-    </w:p>
-    <w:p>
-      <w:r>
-        <w:t>You may apply an infusion as a move action instead of a standard action. At 10 Guardian Hit Dice, once per encounter, you may apply an infusion as a swift action.</w:t>
-      </w:r>
-    </w:p>
-    <w:p>
-      <w:pPr>
-        <w:pStyle w:val="Heading3"/>
-      </w:pPr>
-      <w:r>
-        <w:t>Emergency Patch</w:t>
-      </w:r>
-    </w:p>
-    <w:p>
-      <w:r>
-        <w:t>Once per encounter, as an immediate action, you may apply one known infusion to yourself or an adjacent willing ally. The infusion must be Bolstering Infusion, Rejuvenating Infusion, Revitalizing Infusion, Angelic Infusion, Focusing Infusion, or another defensive infusion approved by the GM. An infusion applied this way lasts for 1 round per Guardian Hit Die unless its normal duration would be shorter.</w:t>
-      </w:r>
-    </w:p>
-    <w:p>
-      <w:pPr>
-        <w:pStyle w:val="Heading3"/>
-      </w:pPr>
-      <w:r>
-        <w:t>Twin Installation</w:t>
-      </w:r>
-    </w:p>
-    <w:p>
-      <w:r>
-        <w:t>When you apply an infusion, you may apply a second infusion as part of the same action. Both infusions must be applied to the same target or to two targets you can touch. If both infusions would normally require a standard action, applying both becomes a full-round action. Each infusion counts normally against the target’s infusion capacity.</w:t>
-      </w:r>
-    </w:p>
-    <w:p>
-      <w:pPr>
-        <w:pStyle w:val="Heading3"/>
-      </w:pPr>
-      <w:r>
-        <w:t>Bulk Calibration</w:t>
-      </w:r>
-    </w:p>
-    <w:p>
-      <w:r>
-        <w:t>When using Bulk Infusion, increase the number of targets you may affect by your key ability modifier, minimum +1. At 10 Guardian Hit Dice, each target affected by your Bulk Infusion may also receive one additional infusion, provided this does not exceed the target’s infusion capacity.</w:t>
-      </w:r>
-    </w:p>
-    <w:p>
-      <w:pPr>
-        <w:pStyle w:val="Heading3"/>
-      </w:pPr>
-      <w:r>
-        <w:t>Lingering Installation</w:t>
-      </w:r>
-    </w:p>
-    <w:p>
-      <w:r>
-        <w:t>When you switch away from Infusion Guardian, choose one active infusion you created. That infusion continues functioning for 1 round per 2 Guardian Hit Dice instead of becoming dormant normally. At 10 Guardian Hit Dice, you may choose two active infusions instead.</w:t>
-      </w:r>
-    </w:p>
-    <w:p>
-      <w:pPr>
-        <w:pStyle w:val="Heading3"/>
-      </w:pPr>
-      <w:r>
-        <w:t>Workshop Memory</w:t>
-      </w:r>
-    </w:p>
-    <w:p>
-      <w:r>
-        <w:t>When you switch back to Infusion Guardian, you may immediately reactivate one dormant infusion you created without spending an action. At 10 Guardian Hit Dice, you may reactivate two dormant infusions instead. Reactivated infusions must still have remaining duration.</w:t>
-      </w:r>
-    </w:p>
-    <w:p>
-      <w:pPr>
-        <w:pStyle w:val="Heading3"/>
-      </w:pPr>
-      <w:r>
-        <w:t>Stable Circuitry</w:t>
-      </w:r>
-    </w:p>
-    <w:p>
-      <w:r>
-        <w:t>Your infusions are difficult to disrupt. Add half your Guardian Hit Dice as a bonus to the DC to dispel your infusions. In addition, when one of your infusions would be suppressed by antimagic or a similar effect, it continues functioning for 1 round before becoming suppressed.</w:t>
-      </w:r>
-    </w:p>
-    <w:p>
-      <w:pPr>
-        <w:pStyle w:val="Heading3"/>
-      </w:pPr>
-      <w:r>
-        <w:t>Efficient Discharge</w:t>
-      </w:r>
-    </w:p>
-    <w:p>
-      <w:r>
-        <w:t>Once per encounter, when one of your infusions would discharge, you may choose for it to remain active. If you do, the discharge effect is halved, and the infusion’s normal passive effect is suppressed until the start of your next turn. An infusion preserved this way cannot discharge again during the same encounter.</w:t>
-      </w:r>
-    </w:p>
-    <w:p>
-      <w:pPr>
-        <w:pStyle w:val="Heading3"/>
-      </w:pPr>
-      <w:r>
-        <w:t>Overclocked Infusion</w:t>
-      </w:r>
-    </w:p>
-    <w:p>
-      <w:r>
-        <w:t>Once per encounter, when you apply or discharge an infusion with a numerical effect, you may overclock it. An overclocked infusion doubles one numerical bonus, damage value, healing value, resistance value, temporary hit point value, or movement value for 1 round. After the overclock ends, the infusion immediately discharges or becomes dormant until the end of the encounter, whichever is worse for the user.</w:t>
-      </w:r>
-    </w:p>
-    <w:p>
-      <w:pPr>
-        <w:pStyle w:val="Heading3"/>
-      </w:pPr>
-      <w:r>
-        <w:t>Field Refit</w:t>
-      </w:r>
-    </w:p>
-    <w:p>
-      <w:r>
-        <w:t>As a move action, you may move one active infusion you created from one willing creature, unattended object, or touched item to another valid target you can touch. The infusion keeps its remaining duration. If the new target is unwilling or the item is attended by an unwilling creature, you must succeed at a melee touch attack, and the target receives any saving throw normally allowed by the infusion.</w:t>
-      </w:r>
-    </w:p>
-    <w:p>
-      <w:pPr>
-        <w:pStyle w:val="Heading3"/>
-      </w:pPr>
-      <w:r>
-        <w:t>Regalia Integration</w:t>
-      </w:r>
-    </w:p>
-    <w:p>
-      <w:r>
-        <w:t>Your infusions synchronize especially well with Regalia, Guardian weapons, and class-bound equipment. When you apply an infusion to your own Regalia component, Guardian Weapon, Regalia staff point, Omni Wrench, bound ship system, construct companion, or similar class-bound item, treat your Guardian Hit Dice as 2 higher for that infusion’s numerical effects and duration. At 10 Guardian Hit Dice, infusions applied to such targets do not count against that target’s infusion capacity for the first infusion only.</w:t>
-      </w:r>
-    </w:p>
-    <w:p>
-      <w:r>
-        <w:br w:type="page"/>
-      </w:r>
-    </w:p>
-    <w:p>
-      <w:pPr>
-        <w:pStyle w:val="Heading1"/>
-      </w:pPr>
-      <w:r>
-        <w:t>Editorial Notes</w:t>
-      </w:r>
-    </w:p>
-    <w:p>
-      <w:pPr>
-        <w:pStyle w:val="Heading3"/>
-      </w:pPr>
-      <w:r>
-        <w:t>Source and scope</w:t>
-      </w:r>
-    </w:p>
-    <w:p>
-      <w:r>
-        <w:t>This volume reformats Taoist(done).pdf in full and Guardian(done).pdf from the universal rules through the complete Infusion Guardian talent section. Alchemy and Ninja Guardian material falls outside Book 1. Source page-export titles, timestamps, blank pages, duplicate list numbers and repeated page-break lines have been removed. Rules, numerical progressions and named options have not been rebalanced.</w:t>
-      </w:r>
-    </w:p>
-    <w:p>
-      <w:pPr>
-        <w:pStyle w:val="Heading3"/>
-      </w:pPr>
-      <w:r>
-        <w:t>Casting descriptions</w:t>
-      </w:r>
-    </w:p>
-    <w:p>
-      <w:r>
-        <w:t>Quick Stats describes a Mid Caster, while Casting calls the Taoist a Low Caster and states that caster level equals class level. The progression table lists a different caster-level progression. Blended Training prose and table also differ. These source statements are retained; this layout edition does not decide which rule takes precedence.</w:t>
-      </w:r>
-    </w:p>
-    <w:p>
-      <w:pPr>
-        <w:pStyle w:val="Heading3"/>
-      </w:pPr>
-      <w:r>
-        <w:t>Unfinished class features</w:t>
-      </w:r>
-    </w:p>
-    <w:p>
-      <w:r>
-        <w:t>The Taoist progression includes unnamed Feature and Cap Feature entries. The Bound Demon option relies on the Blade Monarch Echoes progression and Echo Progression Table, which are not included in these source PDFs. Those missing rules have not been reconstructed.</w:t>
-      </w:r>
-    </w:p>
-    <w:p>
-      <w:pPr>
-        <w:pStyle w:val="Heading3"/>
-      </w:pPr>
-      <w:r>
         <w:t>Guardian dependencies</w:t>
       </w:r>
     </w:p>
     <w:p>
       <w:r>
-        <w:t>Sphere, martial, imprint, invocation and rune options refer to external systems. Geomancy explicitly remains pending. Its reserved table uses the source header Infusions Known, but the source supplies no separate Infusion Guardian progression table or complete infusion list. The reserved table is preserved under Geomancy rather than reassigned by inference.</w:t>
+        <w:t>Sphere, martial, imprint, invocation and rune options refer to external systems. The supplied source does not provide a separate Infusion Guardian progression table or complete infusion list. No missing rules have been invented.</w:t>
       </w:r>
     </w:p>
     <w:p>

</xml_diff>